<commit_message>
Actualización de documentos con variables de montos nuevas y configuración adicional para servicio de docentes coordinadores
</commit_message>
<xml_diff>
--- a/Modelos_documentos/modelo_cotizacion.docx
+++ b/Modelos_documentos/modelo_cotizacion.docx
@@ -298,7 +298,7 @@
           <w:szCs w:val="24"/>
           <w:lang w:val="es-ES" w:eastAsia="es-ES"/>
         </w:rPr>
-        <w:t>26 de agosto de 2025</w:t>
+        <w:t>17 de diciembre de 2025</w:t>
       </w:r>
       <w:r>
         <w:rPr>
@@ -490,7 +490,19 @@
           <w:szCs w:val="24"/>
           <w:lang w:eastAsia="es-PE"/>
         </w:rPr>
-        <w:t xml:space="preserve">A su solicitud, presento la cotización para el </w:t>
+        <w:t>A su solicitud, presento la cotización pa</w:t>
+      </w:r>
+      <w:bookmarkStart w:id="0" w:name="_GoBack"/>
+      <w:bookmarkEnd w:id="0"/>
+      <w:r>
+        <w:rPr>
+          <w:rFonts w:ascii="Garamond" w:eastAsia="Times New Roman" w:hAnsi="Garamond" w:cs="Adobe Devanagari"/>
+          <w:color w:val="000000"/>
+          <w:sz w:val="24"/>
+          <w:szCs w:val="24"/>
+          <w:lang w:eastAsia="es-PE"/>
+        </w:rPr>
+        <w:t xml:space="preserve">ra el </w:t>
       </w:r>
       <w:proofErr w:type="spellStart"/>
       <w:r>
@@ -588,8 +600,6 @@
         </w:rPr>
         <w:t>actividades_admin</w:t>
       </w:r>
-      <w:bookmarkStart w:id="0" w:name="_GoBack"/>
-      <w:bookmarkEnd w:id="0"/>
     </w:p>
     <w:p>
       <w:pPr>
@@ -679,7 +689,15 @@
           <w:sz w:val="24"/>
           <w:szCs w:val="24"/>
         </w:rPr>
-        <w:t>Monto total del servicio</w:t>
+        <w:t xml:space="preserve">Monto </w:t>
+      </w:r>
+      <w:r>
+        <w:rPr>
+          <w:rFonts w:ascii="Garamond" w:hAnsi="Garamond" w:cs="Adobe Devanagari"/>
+          <w:sz w:val="24"/>
+          <w:szCs w:val="24"/>
+        </w:rPr>
+        <w:t>del servicio:</w:t>
       </w:r>
       <w:r>
         <w:rPr>
@@ -701,34 +719,6 @@
         <w:t>monto_subtotal</w:t>
       </w:r>
       <w:proofErr w:type="spellEnd"/>
-      <w:r>
-        <w:rPr>
-          <w:rFonts w:ascii="Garamond" w:hAnsi="Garamond"/>
-          <w:sz w:val="24"/>
-          <w:szCs w:val="24"/>
-        </w:rPr>
-        <w:t xml:space="preserve">, </w:t>
-      </w:r>
-      <w:r>
-        <w:rPr>
-          <w:rFonts w:ascii="Garamond" w:eastAsia="Times New Roman" w:hAnsi="Garamond" w:cs="Adobe Devanagari"/>
-          <w:color w:val="000000"/>
-          <w:sz w:val="24"/>
-          <w:szCs w:val="24"/>
-          <w:lang w:eastAsia="es-PE"/>
-        </w:rPr>
-        <w:t>i</w:t>
-      </w:r>
-      <w:r>
-        <w:rPr>
-          <w:rFonts w:ascii="Garamond" w:eastAsia="Times New Roman" w:hAnsi="Garamond" w:cs="Adobe Devanagari"/>
-          <w:color w:val="000000"/>
-          <w:sz w:val="24"/>
-          <w:szCs w:val="24"/>
-          <w:lang w:eastAsia="es-PE"/>
-        </w:rPr>
-        <w:t>ncluye el impuesto y la contribución de ley.</w:t>
-      </w:r>
     </w:p>
     <w:p>
       <w:pPr>

</xml_diff>

<commit_message>
Actualización de documentos y mejoras en la generación de cotizaciones para administrativos
</commit_message>
<xml_diff>
--- a/Modelos_documentos/modelo_cotizacion.docx
+++ b/Modelos_documentos/modelo_cotizacion.docx
@@ -1,6 +1,6 @@
 
 <file path=word/document.xml><?xml version="1.0" encoding="utf-8"?>
-<w:document xmlns:wpc="http://schemas.microsoft.com/office/word/2010/wordprocessingCanvas" xmlns:cx="http://schemas.microsoft.com/office/drawing/2014/chartex" xmlns:mc="http://schemas.openxmlformats.org/markup-compatibility/2006" xmlns:o="urn:schemas-microsoft-com:office:office" xmlns:r="http://schemas.openxmlformats.org/officeDocument/2006/relationships" xmlns:m="http://schemas.openxmlformats.org/officeDocument/2006/math" xmlns:v="urn:schemas-microsoft-com:vml" xmlns:wp14="http://schemas.microsoft.com/office/word/2010/wordprocessingDrawing" xmlns:wp="http://schemas.openxmlformats.org/drawingml/2006/wordprocessingDrawing" xmlns:w10="urn:schemas-microsoft-com:office:word" xmlns:w="http://schemas.openxmlformats.org/wordprocessingml/2006/main" xmlns:w14="http://schemas.microsoft.com/office/word/2010/wordml" xmlns:w15="http://schemas.microsoft.com/office/word/2012/wordml" xmlns:w16se="http://schemas.microsoft.com/office/word/2015/wordml/symex" xmlns:wpg="http://schemas.microsoft.com/office/word/2010/wordprocessingGroup" xmlns:wpi="http://schemas.microsoft.com/office/word/2010/wordprocessingInk" xmlns:wne="http://schemas.microsoft.com/office/word/2006/wordml" xmlns:wps="http://schemas.microsoft.com/office/word/2010/wordprocessingShape" mc:Ignorable="w14 w15 w16se wp14">
+<w:document xmlns:wpc="http://schemas.microsoft.com/office/word/2010/wordprocessingCanvas" xmlns:cx="http://schemas.microsoft.com/office/drawing/2014/chartex" xmlns:cx1="http://schemas.microsoft.com/office/drawing/2015/9/8/chartex" xmlns:cx2="http://schemas.microsoft.com/office/drawing/2015/10/21/chartex" xmlns:cx3="http://schemas.microsoft.com/office/drawing/2016/5/9/chartex" xmlns:cx4="http://schemas.microsoft.com/office/drawing/2016/5/10/chartex" xmlns:cx5="http://schemas.microsoft.com/office/drawing/2016/5/11/chartex" xmlns:cx6="http://schemas.microsoft.com/office/drawing/2016/5/12/chartex" xmlns:cx7="http://schemas.microsoft.com/office/drawing/2016/5/13/chartex" xmlns:cx8="http://schemas.microsoft.com/office/drawing/2016/5/14/chartex" xmlns:mc="http://schemas.openxmlformats.org/markup-compatibility/2006" xmlns:aink="http://schemas.microsoft.com/office/drawing/2016/ink" xmlns:am3d="http://schemas.microsoft.com/office/drawing/2017/model3d" xmlns:o="urn:schemas-microsoft-com:office:office" xmlns:oel="http://schemas.microsoft.com/office/2019/extlst" xmlns:r="http://schemas.openxmlformats.org/officeDocument/2006/relationships" xmlns:m="http://schemas.openxmlformats.org/officeDocument/2006/math" xmlns:v="urn:schemas-microsoft-com:vml" xmlns:wp14="http://schemas.microsoft.com/office/word/2010/wordprocessingDrawing" xmlns:wp="http://schemas.openxmlformats.org/drawingml/2006/wordprocessingDrawing" xmlns:w10="urn:schemas-microsoft-com:office:word" xmlns:w="http://schemas.openxmlformats.org/wordprocessingml/2006/main" xmlns:w14="http://schemas.microsoft.com/office/word/2010/wordml" xmlns:w15="http://schemas.microsoft.com/office/word/2012/wordml" xmlns:w16cex="http://schemas.microsoft.com/office/word/2018/wordml/cex" xmlns:w16cid="http://schemas.microsoft.com/office/word/2016/wordml/cid" xmlns:w16="http://schemas.microsoft.com/office/word/2018/wordml" xmlns:w16du="http://schemas.microsoft.com/office/word/2023/wordml/word16du" xmlns:w16sdtdh="http://schemas.microsoft.com/office/word/2020/wordml/sdtdatahash" xmlns:w16sdtfl="http://schemas.microsoft.com/office/word/2024/wordml/sdtformatlock" xmlns:w16se="http://schemas.microsoft.com/office/word/2015/wordml/symex" xmlns:wpg="http://schemas.microsoft.com/office/word/2010/wordprocessingGroup" xmlns:wpi="http://schemas.microsoft.com/office/word/2010/wordprocessingInk" xmlns:wne="http://schemas.microsoft.com/office/word/2006/wordml" xmlns:wps="http://schemas.microsoft.com/office/word/2010/wordprocessingShape" mc:Ignorable="w14 w15 w16se w16cid w16 w16cex w16sdtdh w16sdtfl w16du wp14">
   <w:body>
     <w:p>
       <w:pPr>
@@ -15,7 +15,6 @@
           <w:lang w:eastAsia="es-PE"/>
         </w:rPr>
       </w:pPr>
-      <w:proofErr w:type="spellStart"/>
       <w:r>
         <w:rPr>
           <w:rFonts w:ascii="Garamond" w:eastAsia="Times New Roman" w:hAnsi="Garamond" w:cs="Adobe Devanagari"/>
@@ -28,7 +27,6 @@
         </w:rPr>
         <w:t>nombre_docente</w:t>
       </w:r>
-      <w:proofErr w:type="spellEnd"/>
     </w:p>
     <w:p>
       <w:pPr>
@@ -43,7 +41,6 @@
           <w:lang w:eastAsia="es-PE"/>
         </w:rPr>
       </w:pPr>
-      <w:proofErr w:type="spellStart"/>
       <w:r>
         <w:rPr>
           <w:rFonts w:ascii="Garamond" w:eastAsia="Times New Roman" w:hAnsi="Garamond" w:cs="Adobe Devanagari"/>
@@ -92,7 +89,6 @@
         </w:rPr>
         <w:t>_cot</w:t>
       </w:r>
-      <w:proofErr w:type="spellEnd"/>
     </w:p>
     <w:p>
       <w:pPr>
@@ -110,7 +106,6 @@
           <w:lang w:eastAsia="es-PE"/>
         </w:rPr>
       </w:pPr>
-      <w:proofErr w:type="spellStart"/>
       <w:r>
         <w:rPr>
           <w:rFonts w:ascii="Garamond" w:eastAsia="Times New Roman" w:hAnsi="Garamond" w:cs="Adobe Devanagari"/>
@@ -123,7 +118,6 @@
         </w:rPr>
         <w:t>ruc_docente_cot</w:t>
       </w:r>
-      <w:proofErr w:type="spellEnd"/>
     </w:p>
     <w:p>
       <w:pPr>
@@ -137,7 +131,6 @@
           <w:szCs w:val="24"/>
         </w:rPr>
       </w:pPr>
-      <w:proofErr w:type="spellStart"/>
       <w:r>
         <w:rPr>
           <w:rFonts w:ascii="Garamond" w:hAnsi="Garamond"/>
@@ -148,7 +141,6 @@
         </w:rPr>
         <w:t>correo_docente_cot</w:t>
       </w:r>
-      <w:proofErr w:type="spellEnd"/>
     </w:p>
     <w:p>
       <w:pPr>
@@ -164,7 +156,6 @@
           <w:szCs w:val="24"/>
         </w:rPr>
       </w:pPr>
-      <w:proofErr w:type="spellStart"/>
       <w:r>
         <w:rPr>
           <w:rFonts w:ascii="Garamond" w:eastAsia="Times New Roman" w:hAnsi="Garamond" w:cs="Adobe Devanagari"/>
@@ -189,7 +180,6 @@
         </w:rPr>
         <w:t>_cot</w:t>
       </w:r>
-      <w:proofErr w:type="spellEnd"/>
     </w:p>
     <w:p>
       <w:pPr>
@@ -298,7 +288,7 @@
           <w:szCs w:val="24"/>
           <w:lang w:val="es-ES" w:eastAsia="es-ES"/>
         </w:rPr>
-        <w:t>17 de diciembre de 2025</w:t>
+        <w:t>5 de enero de 2026</w:t>
       </w:r>
       <w:r>
         <w:rPr>
@@ -490,21 +480,8 @@
           <w:szCs w:val="24"/>
           <w:lang w:eastAsia="es-PE"/>
         </w:rPr>
-        <w:t>A su solicitud, presento la cotización pa</w:t>
-      </w:r>
-      <w:bookmarkStart w:id="0" w:name="_GoBack"/>
-      <w:bookmarkEnd w:id="0"/>
-      <w:r>
-        <w:rPr>
-          <w:rFonts w:ascii="Garamond" w:eastAsia="Times New Roman" w:hAnsi="Garamond" w:cs="Adobe Devanagari"/>
-          <w:color w:val="000000"/>
-          <w:sz w:val="24"/>
-          <w:szCs w:val="24"/>
-          <w:lang w:eastAsia="es-PE"/>
-        </w:rPr>
-        <w:t xml:space="preserve">ra el </w:t>
-      </w:r>
-      <w:proofErr w:type="spellStart"/>
+        <w:t xml:space="preserve">A su solicitud, presento la cotización para el </w:t>
+      </w:r>
       <w:r>
         <w:rPr>
           <w:rFonts w:ascii="Garamond" w:eastAsia="Times New Roman" w:hAnsi="Garamond" w:cs="Adobe Devanagari"/>
@@ -517,7 +494,6 @@
         </w:rPr>
         <w:t>descripcion_servicio</w:t>
       </w:r>
-      <w:proofErr w:type="spellEnd"/>
       <w:r>
         <w:rPr>
           <w:rFonts w:ascii="Garamond" w:hAnsi="Garamond"/>
@@ -546,7 +522,6 @@
         </w:rPr>
         <w:t xml:space="preserve">bajo la modalidad </w:t>
       </w:r>
-      <w:proofErr w:type="spellStart"/>
       <w:r>
         <w:rPr>
           <w:rFonts w:ascii="Garamond" w:eastAsia="Times New Roman" w:hAnsi="Garamond" w:cs="Adobe Devanagari"/>
@@ -557,7 +532,6 @@
         </w:rPr>
         <w:t>modalidad_servicio</w:t>
       </w:r>
-      <w:proofErr w:type="spellEnd"/>
       <w:r>
         <w:rPr>
           <w:rFonts w:ascii="Garamond" w:eastAsia="Times New Roman" w:hAnsi="Garamond" w:cs="Adobe Devanagari"/>
@@ -598,7 +572,16 @@
           <w:szCs w:val="24"/>
           <w:lang w:val="es-ES" w:eastAsia="es-ES"/>
         </w:rPr>
-        <w:t>actividades_admin</w:t>
+        <w:t>a</w:t>
+      </w:r>
+      <w:r>
+        <w:rPr>
+          <w:rFonts w:ascii="Garamond" w:eastAsia="Times New Roman" w:hAnsi="Garamond" w:cs="Adobe Devanagari"/>
+          <w:sz w:val="24"/>
+          <w:szCs w:val="24"/>
+          <w:lang w:val="es-ES" w:eastAsia="es-ES"/>
+        </w:rPr>
+        <w:t>ctividades_admin</w:t>
       </w:r>
     </w:p>
     <w:p>
@@ -661,7 +644,6 @@
         </w:rPr>
         <w:t xml:space="preserve"> </w:t>
       </w:r>
-      <w:proofErr w:type="spellStart"/>
       <w:r>
         <w:rPr>
           <w:rFonts w:ascii="Garamond" w:hAnsi="Garamond" w:cs="Adobe Devanagari"/>
@@ -672,7 +654,6 @@
         </w:rPr>
         <w:t>categoria_monto</w:t>
       </w:r>
-      <w:proofErr w:type="spellEnd"/>
     </w:p>
     <w:p>
       <w:pPr>
@@ -707,7 +688,6 @@
         </w:rPr>
         <w:t xml:space="preserve"> </w:t>
       </w:r>
-      <w:proofErr w:type="spellStart"/>
       <w:r>
         <w:rPr>
           <w:rFonts w:ascii="Garamond" w:hAnsi="Garamond"/>
@@ -718,7 +698,6 @@
         </w:rPr>
         <w:t>monto_subtotal</w:t>
       </w:r>
-      <w:proofErr w:type="spellEnd"/>
     </w:p>
     <w:p>
       <w:pPr>
@@ -840,8 +819,6 @@
           <w:lang w:val="pt-BR" w:eastAsia="es-PE"/>
         </w:rPr>
       </w:pPr>
-      <w:proofErr w:type="spellStart"/>
-      <w:proofErr w:type="gramStart"/>
       <w:r>
         <w:rPr>
           <w:rFonts w:ascii="Garamond" w:eastAsia="Times New Roman" w:hAnsi="Garamond" w:cs="Adobe Devanagari"/>
@@ -864,22 +841,8 @@
           <w:szCs w:val="24"/>
           <w:lang w:val="pt-BR" w:eastAsia="es-PE"/>
         </w:rPr>
-        <w:t>irma</w:t>
-      </w:r>
-      <w:proofErr w:type="gramEnd"/>
-      <w:r>
-        <w:rPr>
-          <w:rFonts w:ascii="Garamond" w:eastAsia="Times New Roman" w:hAnsi="Garamond" w:cs="Adobe Devanagari"/>
-          <w:b/>
-          <w:bCs/>
-          <w:color w:val="000000"/>
-          <w:sz w:val="24"/>
-          <w:szCs w:val="24"/>
-          <w:lang w:val="pt-BR" w:eastAsia="es-PE"/>
-        </w:rPr>
-        <w:t>_docente</w:t>
-      </w:r>
-      <w:proofErr w:type="spellEnd"/>
+        <w:t>irma_docente</w:t>
+      </w:r>
     </w:p>
     <w:p>
       <w:pPr>
@@ -894,8 +857,6 @@
           <w:lang w:val="pt-BR" w:eastAsia="es-PE"/>
         </w:rPr>
       </w:pPr>
-      <w:proofErr w:type="spellStart"/>
-      <w:proofErr w:type="gramStart"/>
       <w:r>
         <w:rPr>
           <w:rFonts w:ascii="Garamond" w:eastAsia="Times New Roman" w:hAnsi="Garamond" w:cs="Adobe Devanagari"/>
@@ -906,22 +867,8 @@
           <w:szCs w:val="24"/>
           <w:lang w:val="pt-BR" w:eastAsia="es-PE"/>
         </w:rPr>
-        <w:t>nombre</w:t>
-      </w:r>
-      <w:proofErr w:type="gramEnd"/>
-      <w:r>
-        <w:rPr>
-          <w:rFonts w:ascii="Garamond" w:eastAsia="Times New Roman" w:hAnsi="Garamond" w:cs="Adobe Devanagari"/>
-          <w:b/>
-          <w:bCs/>
-          <w:color w:val="000000"/>
-          <w:sz w:val="24"/>
-          <w:szCs w:val="24"/>
-          <w:lang w:val="pt-BR" w:eastAsia="es-PE"/>
-        </w:rPr>
-        <w:t>_docente</w:t>
-      </w:r>
-      <w:proofErr w:type="spellEnd"/>
+        <w:t>nombre_docente</w:t>
+      </w:r>
     </w:p>
     <w:p>
       <w:pPr>
@@ -936,7 +883,6 @@
           <w:lang w:val="pt-BR"/>
         </w:rPr>
       </w:pPr>
-      <w:proofErr w:type="spellStart"/>
       <w:r>
         <w:rPr>
           <w:rFonts w:ascii="Garamond" w:eastAsia="Times New Roman" w:hAnsi="Garamond" w:cs="Adobe Devanagari"/>
@@ -973,7 +919,6 @@
         </w:rPr>
         <w:t>_cot</w:t>
       </w:r>
-      <w:proofErr w:type="spellEnd"/>
     </w:p>
     <w:sectPr>
       <w:pgSz w:w="12240" w:h="15840"/>
@@ -986,7 +931,7 @@
 </file>
 
 <file path=word/numbering.xml><?xml version="1.0" encoding="utf-8"?>
-<w:numbering xmlns:wpc="http://schemas.microsoft.com/office/word/2010/wordprocessingCanvas" xmlns:cx="http://schemas.microsoft.com/office/drawing/2014/chartex" xmlns:mc="http://schemas.openxmlformats.org/markup-compatibility/2006" xmlns:o="urn:schemas-microsoft-com:office:office" xmlns:r="http://schemas.openxmlformats.org/officeDocument/2006/relationships" xmlns:m="http://schemas.openxmlformats.org/officeDocument/2006/math" xmlns:v="urn:schemas-microsoft-com:vml" xmlns:wp14="http://schemas.microsoft.com/office/word/2010/wordprocessingDrawing" xmlns:wp="http://schemas.openxmlformats.org/drawingml/2006/wordprocessingDrawing" xmlns:w10="urn:schemas-microsoft-com:office:word" xmlns:w="http://schemas.openxmlformats.org/wordprocessingml/2006/main" xmlns:w14="http://schemas.microsoft.com/office/word/2010/wordml" xmlns:w15="http://schemas.microsoft.com/office/word/2012/wordml" xmlns:w16se="http://schemas.microsoft.com/office/word/2015/wordml/symex" xmlns:wpg="http://schemas.microsoft.com/office/word/2010/wordprocessingGroup" xmlns:wpi="http://schemas.microsoft.com/office/word/2010/wordprocessingInk" xmlns:wne="http://schemas.microsoft.com/office/word/2006/wordml" xmlns:wps="http://schemas.microsoft.com/office/word/2010/wordprocessingShape" mc:Ignorable="w14 w15 w16se wp14">
+<w:numbering xmlns:wpc="http://schemas.microsoft.com/office/word/2010/wordprocessingCanvas" xmlns:cx="http://schemas.microsoft.com/office/drawing/2014/chartex" xmlns:cx1="http://schemas.microsoft.com/office/drawing/2015/9/8/chartex" xmlns:cx2="http://schemas.microsoft.com/office/drawing/2015/10/21/chartex" xmlns:cx3="http://schemas.microsoft.com/office/drawing/2016/5/9/chartex" xmlns:cx4="http://schemas.microsoft.com/office/drawing/2016/5/10/chartex" xmlns:cx5="http://schemas.microsoft.com/office/drawing/2016/5/11/chartex" xmlns:cx6="http://schemas.microsoft.com/office/drawing/2016/5/12/chartex" xmlns:cx7="http://schemas.microsoft.com/office/drawing/2016/5/13/chartex" xmlns:cx8="http://schemas.microsoft.com/office/drawing/2016/5/14/chartex" xmlns:mc="http://schemas.openxmlformats.org/markup-compatibility/2006" xmlns:aink="http://schemas.microsoft.com/office/drawing/2016/ink" xmlns:am3d="http://schemas.microsoft.com/office/drawing/2017/model3d" xmlns:o="urn:schemas-microsoft-com:office:office" xmlns:oel="http://schemas.microsoft.com/office/2019/extlst" xmlns:r="http://schemas.openxmlformats.org/officeDocument/2006/relationships" xmlns:m="http://schemas.openxmlformats.org/officeDocument/2006/math" xmlns:v="urn:schemas-microsoft-com:vml" xmlns:wp14="http://schemas.microsoft.com/office/word/2010/wordprocessingDrawing" xmlns:wp="http://schemas.openxmlformats.org/drawingml/2006/wordprocessingDrawing" xmlns:w10="urn:schemas-microsoft-com:office:word" xmlns:w="http://schemas.openxmlformats.org/wordprocessingml/2006/main" xmlns:w14="http://schemas.microsoft.com/office/word/2010/wordml" xmlns:w15="http://schemas.microsoft.com/office/word/2012/wordml" xmlns:w16cex="http://schemas.microsoft.com/office/word/2018/wordml/cex" xmlns:w16cid="http://schemas.microsoft.com/office/word/2016/wordml/cid" xmlns:w16="http://schemas.microsoft.com/office/word/2018/wordml" xmlns:w16du="http://schemas.microsoft.com/office/word/2023/wordml/word16du" xmlns:w16sdtdh="http://schemas.microsoft.com/office/word/2020/wordml/sdtdatahash" xmlns:w16sdtfl="http://schemas.microsoft.com/office/word/2024/wordml/sdtformatlock" xmlns:w16se="http://schemas.microsoft.com/office/word/2015/wordml/symex" xmlns:wpg="http://schemas.microsoft.com/office/word/2010/wordprocessingGroup" xmlns:wpi="http://schemas.microsoft.com/office/word/2010/wordprocessingInk" xmlns:wne="http://schemas.microsoft.com/office/word/2006/wordml" xmlns:wps="http://schemas.microsoft.com/office/word/2010/wordprocessingShape" mc:Ignorable="w14 w15 w16se w16cid w16 w16cex w16sdtdh w16sdtfl w16du wp14">
   <w:abstractNum w:abstractNumId="0" w15:restartNumberingAfterBreak="0">
     <w:nsid w:val="0D7C0568"/>
     <w:multiLevelType w:val="hybridMultilevel"/>
@@ -1099,17 +1044,17 @@
       </w:rPr>
     </w:lvl>
   </w:abstractNum>
-  <w:num w:numId="1">
+  <w:num w:numId="1" w16cid:durableId="1659916549">
     <w:abstractNumId w:val="0"/>
   </w:num>
-  <w:num w:numId="2">
+  <w:num w:numId="2" w16cid:durableId="2070181641">
     <w:abstractNumId w:val="0"/>
   </w:num>
 </w:numbering>
 </file>
 
 <file path=word/styles.xml><?xml version="1.0" encoding="utf-8"?>
-<w:styles xmlns:mc="http://schemas.openxmlformats.org/markup-compatibility/2006" xmlns:r="http://schemas.openxmlformats.org/officeDocument/2006/relationships" xmlns:w="http://schemas.openxmlformats.org/wordprocessingml/2006/main" xmlns:w14="http://schemas.microsoft.com/office/word/2010/wordml" xmlns:w15="http://schemas.microsoft.com/office/word/2012/wordml" xmlns:w16se="http://schemas.microsoft.com/office/word/2015/wordml/symex" mc:Ignorable="w14 w15 w16se">
+<w:styles xmlns:mc="http://schemas.openxmlformats.org/markup-compatibility/2006" xmlns:r="http://schemas.openxmlformats.org/officeDocument/2006/relationships" xmlns:w="http://schemas.openxmlformats.org/wordprocessingml/2006/main" xmlns:w14="http://schemas.microsoft.com/office/word/2010/wordml" xmlns:w15="http://schemas.microsoft.com/office/word/2012/wordml" xmlns:w16cex="http://schemas.microsoft.com/office/word/2018/wordml/cex" xmlns:w16cid="http://schemas.microsoft.com/office/word/2016/wordml/cid" xmlns:w16="http://schemas.microsoft.com/office/word/2018/wordml" xmlns:w16du="http://schemas.microsoft.com/office/word/2023/wordml/word16du" xmlns:w16sdtdh="http://schemas.microsoft.com/office/word/2020/wordml/sdtdatahash" xmlns:w16sdtfl="http://schemas.microsoft.com/office/word/2024/wordml/sdtformatlock" xmlns:w16se="http://schemas.microsoft.com/office/word/2015/wordml/symex" mc:Ignorable="w14 w15 w16se w16cid w16 w16cex w16sdtdh w16sdtfl w16du">
   <w:docDefaults>
     <w:rPrDefault>
       <w:rPr>
@@ -1125,7 +1070,7 @@
       </w:pPr>
     </w:pPrDefault>
   </w:docDefaults>
-  <w:latentStyles w:defLockedState="0" w:defUIPriority="99" w:defSemiHidden="0" w:defUnhideWhenUsed="0" w:defQFormat="0" w:count="371">
+  <w:latentStyles w:defLockedState="0" w:defUIPriority="99" w:defSemiHidden="0" w:defUnhideWhenUsed="0" w:defQFormat="0" w:count="376">
     <w:lsdException w:name="Normal" w:uiPriority="0" w:qFormat="1"/>
     <w:lsdException w:name="heading 1" w:uiPriority="9" w:qFormat="1"/>
     <w:lsdException w:name="heading 2" w:semiHidden="1" w:uiPriority="9" w:unhideWhenUsed="1" w:qFormat="1"/>
@@ -1497,6 +1442,11 @@
     <w:lsdException w:name="List Table 5 Dark Accent 6" w:uiPriority="50"/>
     <w:lsdException w:name="List Table 6 Colorful Accent 6" w:uiPriority="51"/>
     <w:lsdException w:name="List Table 7 Colorful Accent 6" w:uiPriority="52"/>
+    <w:lsdException w:name="Mention" w:semiHidden="1" w:unhideWhenUsed="1"/>
+    <w:lsdException w:name="Smart Hyperlink" w:semiHidden="1" w:unhideWhenUsed="1"/>
+    <w:lsdException w:name="Hashtag" w:semiHidden="1" w:unhideWhenUsed="1"/>
+    <w:lsdException w:name="Unresolved Mention" w:semiHidden="1" w:unhideWhenUsed="1"/>
+    <w:lsdException w:name="Smart Link" w:semiHidden="1" w:unhideWhenUsed="1"/>
   </w:latentStyles>
   <w:style w:type="paragraph" w:default="1" w:styleId="Normal">
     <w:name w:val="Normal"/>

</xml_diff>